<commit_message>
Metodos mejorados y abstraidos
</commit_message>
<xml_diff>
--- a/format/Evidencia de Pruebas Template.docx
+++ b/format/Evidencia de Pruebas Template.docx
@@ -340,23 +340,13 @@
                 <w:szCs w:val="20"/>
               </w:rPr>
             </w:pPr>
-            <w:proofErr w:type="gramStart"/>
-            <w:r>
-              <w:rPr>
-                <w:rFonts w:ascii="Arial" w:hAnsi="Arial" w:cs="Arial"/>
-                <w:sz w:val="20"/>
-                <w:szCs w:val="20"/>
-              </w:rPr>
-              <w:t>ID</w:t>
-            </w:r>
-            <w:proofErr w:type="gramEnd"/>
-            <w:r>
-              <w:rPr>
-                <w:rFonts w:ascii="Arial" w:hAnsi="Arial" w:cs="Arial"/>
-                <w:sz w:val="20"/>
-                <w:szCs w:val="20"/>
-              </w:rPr>
-              <w:t xml:space="preserve"> Caso Prueba:</w:t>
+            <w:r>
+              <w:rPr>
+                <w:rFonts w:ascii="Arial" w:hAnsi="Arial" w:cs="Arial"/>
+                <w:sz w:val="20"/>
+                <w:szCs w:val="20"/>
+              </w:rPr>
+              <w:t>ID Caso Prueba:</w:t>
             </w:r>
           </w:p>
         </w:tc>
@@ -374,6 +364,7 @@
                 <w:rFonts w:ascii="Arial" w:hAnsi="Arial" w:cs="Arial"/>
                 <w:sz w:val="20"/>
                 <w:szCs w:val="20"/>
+                <w:lang w:val="es-PE"/>
               </w:rPr>
             </w:pPr>
             <w:r>
@@ -382,7 +373,26 @@
                 <w:sz w:val="20"/>
                 <w:szCs w:val="20"/>
               </w:rPr>
-              <w:t>{{id}}</w:t>
+              <w:t>{{</w:t>
+            </w:r>
+            <w:proofErr w:type="spellStart"/>
+            <w:r>
+              <w:rPr>
+                <w:rFonts w:ascii="Arial" w:hAnsi="Arial" w:cs="Arial"/>
+                <w:sz w:val="20"/>
+                <w:szCs w:val="20"/>
+                <w:lang w:val="es-PE"/>
+              </w:rPr>
+              <w:t>ID_del_caso</w:t>
+            </w:r>
+            <w:proofErr w:type="spellEnd"/>
+            <w:r>
+              <w:rPr>
+                <w:rFonts w:ascii="Arial" w:hAnsi="Arial" w:cs="Arial"/>
+                <w:sz w:val="20"/>
+                <w:szCs w:val="20"/>
+              </w:rPr>
+              <w:t>}}</w:t>
             </w:r>
           </w:p>
         </w:tc>
@@ -445,6 +455,7 @@
                 <w:rFonts w:ascii="Arial" w:hAnsi="Arial" w:cs="Arial"/>
                 <w:sz w:val="20"/>
                 <w:szCs w:val="20"/>
+                <w:u w:val="single"/>
                 <w:lang w:val="es-PE"/>
               </w:rPr>
             </w:pPr>
@@ -464,7 +475,61 @@
                 <w:szCs w:val="20"/>
                 <w:lang w:val="es-PE"/>
               </w:rPr>
-              <w:t>title</w:t>
+              <w:t>Descripción</w:t>
+            </w:r>
+            <w:r>
+              <w:rPr>
+                <w:rFonts w:ascii="Arial" w:hAnsi="Arial" w:cs="Arial"/>
+                <w:sz w:val="20"/>
+                <w:szCs w:val="20"/>
+                <w:lang w:val="es-PE"/>
+              </w:rPr>
+              <w:t>_</w:t>
+            </w:r>
+            <w:r>
+              <w:rPr>
+                <w:rFonts w:ascii="Arial" w:hAnsi="Arial" w:cs="Arial"/>
+                <w:sz w:val="20"/>
+                <w:szCs w:val="20"/>
+                <w:lang w:val="es-PE"/>
+              </w:rPr>
+              <w:t>de</w:t>
+            </w:r>
+            <w:r>
+              <w:rPr>
+                <w:rFonts w:ascii="Arial" w:hAnsi="Arial" w:cs="Arial"/>
+                <w:sz w:val="20"/>
+                <w:szCs w:val="20"/>
+                <w:lang w:val="es-PE"/>
+              </w:rPr>
+              <w:t>_</w:t>
+            </w:r>
+            <w:r>
+              <w:rPr>
+                <w:rFonts w:ascii="Arial" w:hAnsi="Arial" w:cs="Arial"/>
+                <w:sz w:val="20"/>
+                <w:szCs w:val="20"/>
+                <w:lang w:val="es-PE"/>
+              </w:rPr>
+              <w:t>la</w:t>
+            </w:r>
+            <w:r>
+              <w:rPr>
+                <w:rFonts w:ascii="Arial" w:hAnsi="Arial" w:cs="Arial"/>
+                <w:sz w:val="20"/>
+                <w:szCs w:val="20"/>
+                <w:lang w:val="es-PE"/>
+              </w:rPr>
+              <w:t>_</w:t>
+            </w:r>
+            <w:r>
+              <w:rPr>
+                <w:rFonts w:ascii="Arial" w:hAnsi="Arial" w:cs="Arial"/>
+                <w:sz w:val="20"/>
+                <w:szCs w:val="20"/>
+                <w:lang w:val="es-PE"/>
+              </w:rPr>
+              <w:t>prueba</w:t>
             </w:r>
             <w:proofErr w:type="spellEnd"/>
             <w:r>
@@ -557,7 +622,6 @@
               </w:rPr>
               <w:t>{{</w:t>
             </w:r>
-            <w:proofErr w:type="spellStart"/>
             <w:r>
               <w:rPr>
                 <w:rFonts w:ascii="Arial" w:hAnsi="Arial" w:cs="Arial"/>
@@ -565,9 +629,8 @@
                 <w:szCs w:val="20"/>
                 <w:lang w:val="es-PE"/>
               </w:rPr>
-              <w:t>preconditions</w:t>
-            </w:r>
-            <w:proofErr w:type="spellEnd"/>
+              <w:t>Prerrequisitos</w:t>
+            </w:r>
             <w:r>
               <w:rPr>
                 <w:rFonts w:ascii="Arial" w:hAnsi="Arial" w:cs="Arial"/>
@@ -664,7 +727,25 @@
                 <w:szCs w:val="20"/>
                 <w:lang w:val="es-PE"/>
               </w:rPr>
-              <w:t>expectedResult</w:t>
+              <w:t>Resultado</w:t>
+            </w:r>
+            <w:r>
+              <w:rPr>
+                <w:rFonts w:ascii="Arial" w:hAnsi="Arial" w:cs="Arial"/>
+                <w:sz w:val="20"/>
+                <w:szCs w:val="20"/>
+                <w:lang w:val="es-PE"/>
+              </w:rPr>
+              <w:t>_</w:t>
+            </w:r>
+            <w:r>
+              <w:rPr>
+                <w:rFonts w:ascii="Arial" w:hAnsi="Arial" w:cs="Arial"/>
+                <w:sz w:val="20"/>
+                <w:szCs w:val="20"/>
+                <w:lang w:val="es-PE"/>
+              </w:rPr>
+              <w:t>esperado</w:t>
             </w:r>
             <w:proofErr w:type="spellEnd"/>
             <w:r>
@@ -974,7 +1055,6 @@
               </w:rPr>
               <w:t xml:space="preserve"> p in </w:t>
             </w:r>
-            <w:proofErr w:type="spellStart"/>
             <w:r>
               <w:rPr>
                 <w:rFonts w:ascii="Arial" w:hAnsi="Arial" w:cs="Arial"/>
@@ -983,9 +1063,8 @@
                 <w:szCs w:val="20"/>
                 <w:lang w:val="es-CO"/>
               </w:rPr>
-              <w:t>steps</w:t>
-            </w:r>
-            <w:proofErr w:type="spellEnd"/>
+              <w:t>Pasos</w:t>
+            </w:r>
             <w:r>
               <w:rPr>
                 <w:rFonts w:ascii="Arial" w:hAnsi="Arial" w:cs="Arial"/>
@@ -1081,7 +1160,6 @@
               <w:t>{{</w:t>
             </w:r>
             <w:proofErr w:type="spellStart"/>
-            <w:proofErr w:type="gramStart"/>
             <w:r>
               <w:rPr>
                 <w:rFonts w:ascii="Arial" w:hAnsi="Arial" w:cs="Arial"/>
@@ -1090,18 +1168,7 @@
                 <w:szCs w:val="20"/>
                 <w:lang w:val="es-CO"/>
               </w:rPr>
-              <w:t>p.desc</w:t>
-            </w:r>
-            <w:proofErr w:type="gramEnd"/>
-            <w:r>
-              <w:rPr>
-                <w:rFonts w:ascii="Arial" w:hAnsi="Arial" w:cs="Arial"/>
-                <w:color w:val="000000"/>
-                <w:sz w:val="20"/>
-                <w:szCs w:val="20"/>
-                <w:lang w:val="es-CO"/>
-              </w:rPr>
-              <w:t>|trim</w:t>
+              <w:t>p.desc|trim</w:t>
             </w:r>
             <w:proofErr w:type="spellEnd"/>
             <w:r>
@@ -2143,16 +2210,14 @@
             </w:rPr>
             <w:t>{{</w:t>
           </w:r>
-          <w:proofErr w:type="spellStart"/>
           <w:r>
             <w:rPr>
               <w:rFonts w:ascii="Arial" w:hAnsi="Arial" w:cs="Arial"/>
               <w:sz w:val="18"/>
               <w:szCs w:val="18"/>
             </w:rPr>
-            <w:t>userStory</w:t>
+            <w:t>HU</w:t>
           </w:r>
-          <w:proofErr w:type="spellEnd"/>
           <w:r>
             <w:rPr>
               <w:rFonts w:ascii="Arial" w:hAnsi="Arial" w:cs="Arial"/>
@@ -2342,7 +2407,23 @@
               <w:sz w:val="18"/>
               <w:szCs w:val="18"/>
             </w:rPr>
-            <w:t>currentDate</w:t>
+            <w:t>Fecha</w:t>
+          </w:r>
+          <w:r>
+            <w:rPr>
+              <w:rFonts w:ascii="Arial" w:hAnsi="Arial" w:cs="Arial"/>
+              <w:sz w:val="18"/>
+              <w:szCs w:val="18"/>
+            </w:rPr>
+            <w:t>_</w:t>
+          </w:r>
+          <w:r>
+            <w:rPr>
+              <w:rFonts w:ascii="Arial" w:hAnsi="Arial" w:cs="Arial"/>
+              <w:sz w:val="18"/>
+              <w:szCs w:val="18"/>
+            </w:rPr>
+            <w:t>actual</w:t>
           </w:r>
           <w:proofErr w:type="spellEnd"/>
           <w:r>
@@ -7765,7 +7846,6 @@
   <w:style w:type="character" w:default="1" w:styleId="Fuentedeprrafopredeter">
     <w:name w:val="Default Paragraph Font"/>
     <w:uiPriority w:val="1"/>
-    <w:semiHidden/>
     <w:unhideWhenUsed/>
   </w:style>
   <w:style w:type="table" w:default="1" w:styleId="Tablanormal">
@@ -8394,21 +8474,6 @@
 </file>
 
 <file path=customXml/item1.xml><?xml version="1.0" encoding="utf-8"?>
-<?mso-contentType ?>
-<FormTemplates xmlns="http://schemas.microsoft.com/sharepoint/v3/contenttype/forms">
-  <Display>DocumentLibraryForm</Display>
-  <Edit>DocumentLibraryForm</Edit>
-  <New>DocumentLibraryForm</New>
-</FormTemplates>
-</file>
-
-<file path=customXml/item2.xml><?xml version="1.0" encoding="utf-8"?>
-<p:properties xmlns:p="http://schemas.microsoft.com/office/2006/metadata/properties" xmlns:xsi="http://www.w3.org/2001/XMLSchema-instance">
-  <documentManagement/>
-</p:properties>
-</file>
-
-<file path=customXml/item3.xml><?xml version="1.0" encoding="utf-8"?>
 <ct:contentTypeSchema xmlns:ct="http://schemas.microsoft.com/office/2006/metadata/contentType" xmlns:ma="http://schemas.microsoft.com/office/2006/metadata/properties/metaAttributes" ct:_="" ma:_="" ma:contentTypeName="Document" ma:contentTypeID="0x0101001A066EF02B77D94395E803AC4AA35D7F" ma:contentTypeVersion="0" ma:contentTypeDescription="Create a new document." ma:contentTypeScope="" ma:versionID="0543758209ba6a344c3b9312d62684a2">
   <xsd:schema xmlns:xsd="http://www.w3.org/2001/XMLSchema" xmlns:xs="http://www.w3.org/2001/XMLSchema" xmlns:p="http://schemas.microsoft.com/office/2006/metadata/properties" targetNamespace="http://schemas.microsoft.com/office/2006/metadata/properties" ma:root="true" ma:fieldsID="c64490b4aec6201516c3a874156f37b2">
     <xsd:element name="properties">
@@ -8522,27 +8587,26 @@
 </ct:contentTypeSchema>
 </file>
 
+<file path=customXml/item2.xml><?xml version="1.0" encoding="utf-8"?>
+<p:properties xmlns:p="http://schemas.microsoft.com/office/2006/metadata/properties" xmlns:xsi="http://www.w3.org/2001/XMLSchema-instance">
+  <documentManagement/>
+</p:properties>
+</file>
+
+<file path=customXml/item3.xml><?xml version="1.0" encoding="utf-8"?>
+<?mso-contentType ?>
+<FormTemplates xmlns="http://schemas.microsoft.com/sharepoint/v3/contenttype/forms">
+  <Display>DocumentLibraryForm</Display>
+  <Edit>DocumentLibraryForm</Edit>
+  <New>DocumentLibraryForm</New>
+</FormTemplates>
+</file>
+
 <file path=customXml/item4.xml><?xml version="1.0" encoding="utf-8"?>
 <b:Sources xmlns:b="http://schemas.openxmlformats.org/officeDocument/2006/bibliography" xmlns="http://schemas.openxmlformats.org/officeDocument/2006/bibliography" SelectedStyle="\APA.XSL" StyleName="APA"/>
 </file>
 
 <file path=customXml/itemProps1.xml><?xml version="1.0" encoding="utf-8"?>
-<ds:datastoreItem xmlns:ds="http://schemas.openxmlformats.org/officeDocument/2006/customXml" ds:itemID="{678CAA3D-8EB3-432F-BF03-45A404C718D4}">
-  <ds:schemaRefs>
-    <ds:schemaRef ds:uri="http://schemas.microsoft.com/sharepoint/v3/contenttype/forms"/>
-  </ds:schemaRefs>
-</ds:datastoreItem>
-</file>
-
-<file path=customXml/itemProps2.xml><?xml version="1.0" encoding="utf-8"?>
-<ds:datastoreItem xmlns:ds="http://schemas.openxmlformats.org/officeDocument/2006/customXml" ds:itemID="{944F1467-4E9E-4F5E-90AB-B6D878A0B03F}">
-  <ds:schemaRefs>
-    <ds:schemaRef ds:uri="http://schemas.microsoft.com/office/2006/metadata/properties"/>
-  </ds:schemaRefs>
-</ds:datastoreItem>
-</file>
-
-<file path=customXml/itemProps3.xml><?xml version="1.0" encoding="utf-8"?>
 <ds:datastoreItem xmlns:ds="http://schemas.openxmlformats.org/officeDocument/2006/customXml" ds:itemID="{3348519C-6AE1-49E8-887F-64A237B33ACD}">
   <ds:schemaRefs>
     <ds:schemaRef ds:uri="http://schemas.microsoft.com/office/2006/metadata/contentType"/>
@@ -8558,6 +8622,22 @@
 </ds:datastoreItem>
 </file>
 
+<file path=customXml/itemProps2.xml><?xml version="1.0" encoding="utf-8"?>
+<ds:datastoreItem xmlns:ds="http://schemas.openxmlformats.org/officeDocument/2006/customXml" ds:itemID="{944F1467-4E9E-4F5E-90AB-B6D878A0B03F}">
+  <ds:schemaRefs>
+    <ds:schemaRef ds:uri="http://schemas.microsoft.com/office/2006/metadata/properties"/>
+  </ds:schemaRefs>
+</ds:datastoreItem>
+</file>
+
+<file path=customXml/itemProps3.xml><?xml version="1.0" encoding="utf-8"?>
+<ds:datastoreItem xmlns:ds="http://schemas.openxmlformats.org/officeDocument/2006/customXml" ds:itemID="{678CAA3D-8EB3-432F-BF03-45A404C718D4}">
+  <ds:schemaRefs>
+    <ds:schemaRef ds:uri="http://schemas.microsoft.com/sharepoint/v3/contenttype/forms"/>
+  </ds:schemaRefs>
+</ds:datastoreItem>
+</file>
+
 <file path=customXml/itemProps4.xml><?xml version="1.0" encoding="utf-8"?>
 <ds:datastoreItem xmlns:ds="http://schemas.openxmlformats.org/officeDocument/2006/customXml" ds:itemID="{E4403D1B-4CB3-4072-8A4C-AF68AE628AD6}">
   <ds:schemaRefs>

</xml_diff>